<commit_message>
Corregeix l'exercici 5, 13 i 15 del dossier A03 ampliat perquè siguin autocontinguts
- Afegeix la creacio i assignacio de contrasenya necessaries (alex, marina)
  sense donar la comanda exacta, per fomentar que l'alumnat la investigui.
- Afegeix la creacio del fitxer de prova informe.txt abans del xifratge GPG.
- Afegeix la instal·lacio de John the Ripper i els passos per generar el
  wordlist i extreure el hash d'un usuari concret abans de l'atac de diccionari.
- Canvia "su <usuari> -c" per "sudo su <usuari> -c" a les demostracions amb
  alex i marina, ja que sense sudo l'ordre falla per a un alumne que no sigui
  root (el compte no te contrasenya propia).
- Afegeix recordatoris de lliurament de captures per cada exercici amb
  terminal, i un bloc final demanant l'historial complet de comandes.
- Regenera les captures de terminal afectades pel canvi de su a sudo su.
</commit_message>
<xml_diff>
--- a/RA1 - Seguretat passiva/AA3 - Seguretat logica/A03_Exercicis_Seguretat_Logica_Ampliat.docx
+++ b/RA1 - Seguretat passiva/AA3 - Seguretat logica/A03_Exercicis_Seguretat_Logica_Ampliat.docx
@@ -507,6 +507,21 @@
               <w:t xml:space="preserve"> S’hi han incorporat també els continguts més recents (identificació, gestors de contrasenyes, autenticació sense contrasenya, models d’autorització MAC i RBAC) i una part pràctica guiada a Ubuntu sobre política de contrasenyes amb PAM, el fitxer /etc/shadow, auditoria amb John the Ripper i xifratge amb GPG.</w:t>
             </w:r>
           </w:p>
+          <w:p>
+            <w:r>
+              <w:rPr>
+                <w:b/>
+                <w:sz w:val="20"/>
+              </w:rPr>
+              <w:t xml:space="preserve">Lliurament de captures: </w:t>
+            </w:r>
+            <w:r>
+              <w:rPr>
+                <w:sz w:val="20"/>
+              </w:rPr>
+              <w:t>sempre que un exercici impliqui treballar amb terminal, cal lliurar una captura de les ordres executades i el seu resultat. Es recomana realitzar tota la pràctica des d'una màquina virtual d'Isard (IsardVDI), per disposar dels permisos necessaris per executar totes les ordres i evitar que l'historial de la sessió s'esborri entre exercicis.</w:t>
+            </w:r>
+          </w:p>
         </w:tc>
       </w:tr>
     </w:tbl>
@@ -983,6 +998,16 @@
             </w:r>
           </w:p>
           <w:p>
+            <w:r>
+              <w:rPr>
+                <w:i/>
+                <w:color w:val="5B6B77"/>
+                <w:sz w:val="18"/>
+              </w:rPr>
+              <w:t>📷 Lliurament: captura de les ordres executades i el resultat.</w:t>
+            </w:r>
+          </w:p>
+          <w:p>
             <w:pPr>
               <w:spacing w:after="160"/>
             </w:pPr>
@@ -1279,6 +1304,223 @@
             </w:r>
           </w:p>
           <w:p>
+            <w:r>
+              <w:rPr>
+                <w:b/>
+                <w:sz w:val="20"/>
+              </w:rPr>
+              <w:t xml:space="preserve">Abans de continuar: </w:t>
+            </w:r>
+            <w:r>
+              <w:rPr>
+                <w:sz w:val="20"/>
+              </w:rPr>
+              <w:t>per fer la comprovació necessitaràs dos usuaris de prova al sistema, alex i marina. Investiga quina ordre de Linux permet crear un usuari nou (amb el seu directori personal) i crea'ls al teu equip.</w:t>
+            </w:r>
+          </w:p>
+          <w:p>
+            <w:r>
+              <w:rPr>
+                <w:b/>
+                <w:sz w:val="20"/>
+              </w:rPr>
+              <w:t xml:space="preserve">Un cop fet, comprova-ho tu mateix: </w:t>
+            </w:r>
+            <w:r>
+              <w:rPr>
+                <w:sz w:val="20"/>
+              </w:rPr>
+              <w:t>crea un directori propi, activa-hi el sticky bit i demostra'n l'efecte intentant esborrar, amb un altre usuari, un fitxer que no és seu dins d'aquell directori.</w:t>
+            </w:r>
+          </w:p>
+          <w:p>
+            <w:pPr>
+              <w:jc w:val="left"/>
+              <w:pBdr>
+                <w:top w:val="single" w:color="CADCE8" w:sz="4"/>
+                <w:bottom w:val="single" w:color="CADCE8" w:sz="4"/>
+                <w:left w:val="single" w:color="CADCE8" w:sz="4"/>
+                <w:right w:val="single" w:color="CADCE8" w:sz="4"/>
+              </w:pBdr>
+              <w:shd w:val="clear" w:fill="F4F7F9"/>
+              <w:spacing w:before="80" w:after="160"/>
+            </w:pPr>
+            <w:r>
+              <w:rPr>
+                <w:rFonts w:ascii="Consolas" w:hAnsi="Consolas"/>
+                <w:sz w:val="19"/>
+              </w:rPr>
+              <w:t>$ mkdir prova_sticky</w:t>
+            </w:r>
+            <w:r>
+              <w:br/>
+            </w:r>
+            <w:r>
+              <w:rPr>
+                <w:rFonts w:ascii="Consolas" w:hAnsi="Consolas"/>
+                <w:sz w:val="19"/>
+              </w:rPr>
+              <w:t>$ ls -ld prova_sticky</w:t>
+            </w:r>
+            <w:r>
+              <w:br/>
+            </w:r>
+            <w:r>
+              <w:rPr>
+                <w:rFonts w:ascii="Consolas" w:hAnsi="Consolas"/>
+                <w:sz w:val="19"/>
+              </w:rPr>
+              <w:t>drwxr-xr-x 2 joan joan 4096 oct  5 06:53 prova_sticky</w:t>
+            </w:r>
+            <w:r>
+              <w:br/>
+            </w:r>
+            <w:r>
+              <w:rPr>
+                <w:rFonts w:ascii="Consolas" w:hAnsi="Consolas"/>
+                <w:sz w:val="19"/>
+              </w:rPr>
+            </w:r>
+            <w:r>
+              <w:br/>
+            </w:r>
+            <w:r>
+              <w:rPr>
+                <w:rFonts w:ascii="Consolas" w:hAnsi="Consolas"/>
+                <w:sz w:val="19"/>
+              </w:rPr>
+              <w:t>$ chmod +t prova_sticky</w:t>
+            </w:r>
+            <w:r>
+              <w:br/>
+            </w:r>
+            <w:r>
+              <w:rPr>
+                <w:rFonts w:ascii="Consolas" w:hAnsi="Consolas"/>
+                <w:sz w:val="19"/>
+              </w:rPr>
+              <w:t>$ ls -ld prova_sticky</w:t>
+            </w:r>
+            <w:r>
+              <w:br/>
+            </w:r>
+            <w:r>
+              <w:rPr>
+                <w:rFonts w:ascii="Consolas" w:hAnsi="Consolas"/>
+                <w:sz w:val="19"/>
+              </w:rPr>
+              <w:t>drwxr-xr-t 2 joan joan 4096 oct  5 06:53 prova_sticky</w:t>
+            </w:r>
+            <w:r>
+              <w:br/>
+            </w:r>
+            <w:r>
+              <w:rPr>
+                <w:rFonts w:ascii="Consolas" w:hAnsi="Consolas"/>
+                <w:sz w:val="19"/>
+              </w:rPr>
+            </w:r>
+            <w:r>
+              <w:br/>
+            </w:r>
+            <w:r>
+              <w:rPr>
+                <w:rFonts w:ascii="Consolas" w:hAnsi="Consolas"/>
+                <w:sz w:val="19"/>
+              </w:rPr>
+              <w:t>$ chmod 1777 prova_sticky</w:t>
+            </w:r>
+            <w:r>
+              <w:br/>
+            </w:r>
+            <w:r>
+              <w:rPr>
+                <w:rFonts w:ascii="Consolas" w:hAnsi="Consolas"/>
+                <w:sz w:val="19"/>
+              </w:rPr>
+              <w:t>$ sudo su alex -c "touch prova_sticky/fitxer_alex.txt"</w:t>
+            </w:r>
+            <w:r>
+              <w:br/>
+            </w:r>
+            <w:r>
+              <w:rPr>
+                <w:rFonts w:ascii="Consolas" w:hAnsi="Consolas"/>
+                <w:sz w:val="19"/>
+              </w:rPr>
+              <w:t>$ sudo su marina -c "rm prova_sticky/fitxer_alex.txt"</w:t>
+            </w:r>
+            <w:r>
+              <w:br/>
+            </w:r>
+            <w:r>
+              <w:rPr>
+                <w:rFonts w:ascii="Consolas" w:hAnsi="Consolas"/>
+                <w:sz w:val="19"/>
+              </w:rPr>
+              <w:t>rm: cannot remove 'prova_sticky/fitxer_alex.txt': Operation not permitted</w:t>
+            </w:r>
+          </w:p>
+          <w:p>
+            <w:r>
+              <w:rPr>
+                <w:i/>
+                <w:color w:val="5B6B77"/>
+                <w:sz w:val="18"/>
+              </w:rPr>
+              <w:t>Captura real: creació del directori, activació del sticky bit (la t final als permisos), i la prova amb dos usuaris diferents: l'Alex crea un fitxer dins el directori compartit, i la Marina no el pot esborrar encara que el directori sigui d'escriptura per a tothom.</w:t>
+            </w:r>
+          </w:p>
+          <w:p>
+            <w:pPr>
+              <w:jc w:val="center"/>
+            </w:pPr>
+            <w:r>
+              <w:drawing>
+                <wp:inline>
+                  <wp:extent cx="3657600" cy="2690173"/>
+                  <wp:docPr id="2" name="Picture 2"/>
+                  <wp:cNvGraphicFramePr>
+                    <a:graphicFrameLocks noChangeAspect="1"/>
+                  </wp:cNvGraphicFramePr>
+                  <a:graphic>
+                    <a:graphicData uri="http://schemas.openxmlformats.org/drawingml/2006/picture">
+                      <pic:pic>
+                        <pic:nvPicPr>
+                          <pic:cNvPr id="0" name="sticky_bit.png"/>
+                          <pic:cNvPicPr/>
+                        </pic:nvPicPr>
+                        <pic:blipFill>
+                          <a:blip r:embed="rId14"/>
+                          <a:stretch>
+                            <a:fillRect/>
+                          </a:stretch>
+                        </pic:blipFill>
+                        <pic:spPr>
+                          <a:xfrm>
+                            <a:off x="0" y="0"/>
+                            <a:ext cx="3657600" cy="2690173"/>
+                          </a:xfrm>
+                          <a:prstGeom prst="rect"/>
+                        </pic:spPr>
+                      </pic:pic>
+                    </a:graphicData>
+                  </a:graphic>
+                </wp:inline>
+              </w:drawing>
+            </w:r>
+          </w:p>
+          <w:p>
+            <w:r>
+              <w:rPr>
+                <w:i/>
+                <w:color w:val="5B6B77"/>
+                <w:sz w:val="18"/>
+              </w:rPr>
+              <w:t>📷 Lliurament: captura de les ordres executades i el resultat.</w:t>
+            </w:r>
+          </w:p>
+          <w:p>
             <w:pPr>
               <w:spacing w:after="160"/>
             </w:pPr>
@@ -2759,6 +3001,16 @@
             </w:r>
           </w:p>
           <w:p>
+            <w:r>
+              <w:rPr>
+                <w:i/>
+                <w:color w:val="5B6B77"/>
+                <w:sz w:val="18"/>
+              </w:rPr>
+              <w:t>📷 Lliurament: captura de les ordres executades i el resultat.</w:t>
+            </w:r>
+          </w:p>
+          <w:p>
             <w:pPr>
               <w:spacing w:after="160"/>
             </w:pPr>
@@ -2964,7 +3216,7 @@
                 <w:rFonts w:ascii="Consolas" w:hAnsi="Consolas"/>
                 <w:sz w:val="19"/>
               </w:rPr>
-              <w:t>$ su alex -c "cat /etc/shadow"</w:t>
+              <w:t>$ sudo su alex -c "cat /etc/shadow"</w:t>
             </w:r>
             <w:r>
               <w:br/>
@@ -3008,8 +3260,8 @@
             <w:r>
               <w:drawing>
                 <wp:inline>
-                  <wp:extent cx="5120640" cy="2083723"/>
-                  <wp:docPr id="1" name="Picture 1"/>
+                  <wp:extent cx="5120640" cy="2083724"/>
+                  <wp:docPr id="3" name="Picture 3"/>
                   <wp:cNvGraphicFramePr>
                     <a:graphicFrameLocks noChangeAspect="1"/>
                   </wp:cNvGraphicFramePr>
@@ -3021,7 +3273,7 @@
                           <pic:cNvPicPr/>
                         </pic:nvPicPr>
                         <pic:blipFill>
-                          <a:blip r:embed="rId9"/>
+                          <a:blip r:embed="rId15"/>
                           <a:stretch>
                             <a:fillRect/>
                           </a:stretch>
@@ -3029,7 +3281,7 @@
                         <pic:spPr>
                           <a:xfrm>
                             <a:off x="0" y="0"/>
-                            <a:ext cx="5120640" cy="2083723"/>
+                            <a:ext cx="5120640" cy="2083724"/>
                           </a:xfrm>
                           <a:prstGeom prst="rect"/>
                         </pic:spPr>
@@ -3088,6 +3340,21 @@
                 <w:sz w:val="20"/>
               </w:rPr>
               <w:t>Quin prefix té l’algorisme de hash de la teva distribució a /etc/shadow, i per què es considera que MD5 ja no és adequat per a aquest ús?</w:t>
+            </w:r>
+          </w:p>
+          <w:p>
+            <w:r>
+              <w:rPr>
+                <w:b/>
+                <w:sz w:val="20"/>
+              </w:rPr>
+              <w:t xml:space="preserve">Abans de continuar: </w:t>
+            </w:r>
+            <w:r>
+              <w:rPr>
+                <w:sz w:val="20"/>
+              </w:rPr>
+              <w:t>perquè el Pas 8 tingui sentit (comprovar l'estat d'un compte i el cicle de bloqueig/desbloqueig), assigna primer una contrasenya a l'usuari alex, si encara no en té cap.</w:t>
             </w:r>
           </w:p>
           <w:p>
@@ -3170,6 +3437,16 @@
                 <w:sz w:val="18"/>
               </w:rPr>
               <w:t>Captura real: “chage -l” tradueix els dies des de 1970 a dates llegibles; “passwd -S” mostra l’estat en una sola línia. En bloquejar el compte, el hash de /etc/shadow queda precedit per un “!” (la contrasenya deixa de ser vàlida, però no s’esborra); en desbloquejar-lo, el “!” desapareix i el compte torna a funcionar amb la mateixa contrasenya d’abans.</w:t>
+            </w:r>
+          </w:p>
+          <w:p>
+            <w:r>
+              <w:rPr>
+                <w:i/>
+                <w:color w:val="5B6B77"/>
+                <w:sz w:val="18"/>
+              </w:rPr>
+              <w:t>📷 Lliurament: captura de les ordres executades i el resultat.</w:t>
             </w:r>
           </w:p>
           <w:p>
@@ -3373,6 +3650,21 @@
             </w:r>
           </w:p>
           <w:p>
+            <w:r>
+              <w:rPr>
+                <w:b/>
+                <w:sz w:val="20"/>
+              </w:rPr>
+              <w:t xml:space="preserve">Abans de continuar: </w:t>
+            </w:r>
+            <w:r>
+              <w:rPr>
+                <w:sz w:val="20"/>
+              </w:rPr>
+              <w:t>assigna a la marina una contrasenya feble que coincideixi amb alguna de les paraules que posaràs al wordlist del Pas 10 (per exemple, una basada en “futbol” + números), perquè puguis reproduir l'atac de diccionari sobre un cas real. Fes-ho abans de continuar amb el Pas 9, ja que aquest capturarà el hash tal com estigui en aquell moment.</w:t>
+            </w:r>
+          </w:p>
+          <w:p>
             <w:pPr>
               <w:spacing w:after="160"/>
             </w:pPr>
@@ -3388,7 +3680,7 @@
                 <w:b w:val="0"/>
                 <w:sz w:val="20"/>
               </w:rPr>
-              <w:t>Combina /etc/passwd i /etc/shadow en un únic fitxer amb el format que espera John the Ripper:</w:t>
+              <w:t>Instal·la John the Ripper (si encara no ho has fet) i combina /etc/passwd i /etc/shadow en un únic fitxer amb el format que espera:</w:t>
             </w:r>
           </w:p>
           <w:p>
@@ -3408,6 +3700,16 @@
                 <w:rFonts w:ascii="Consolas" w:hAnsi="Consolas"/>
                 <w:sz w:val="19"/>
               </w:rPr>
+              <w:t>$ sudo apt install john</w:t>
+            </w:r>
+            <w:r>
+              <w:br/>
+            </w:r>
+            <w:r>
+              <w:rPr>
+                <w:rFonts w:ascii="Consolas" w:hAnsi="Consolas"/>
+                <w:sz w:val="19"/>
+              </w:rPr>
               <w:t>$ sudo unshadow /etc/passwd /etc/shadow &gt; hashes.txt</w:t>
             </w:r>
           </w:p>
@@ -3427,7 +3729,176 @@
                 <w:b w:val="0"/>
                 <w:sz w:val="20"/>
               </w:rPr>
-              <w:t>Prepara una llista de paraules (“wordlist”) amb candidats plausibles i llança John the Ripper contra els hashos:</w:t>
+              <w:t>Prepara una llista de paraules (“wordlist”) amb candidats plausibles, extreu del fitxer combinat únicament el hash de l'usuari que vols atacar, i llança John the Ripper contra aquest hash:</w:t>
+            </w:r>
+          </w:p>
+          <w:p>
+            <w:pPr>
+              <w:jc w:val="left"/>
+              <w:pBdr>
+                <w:top w:val="single" w:color="CADCE8" w:sz="4"/>
+                <w:bottom w:val="single" w:color="CADCE8" w:sz="4"/>
+                <w:left w:val="single" w:color="CADCE8" w:sz="4"/>
+                <w:right w:val="single" w:color="CADCE8" w:sz="4"/>
+              </w:pBdr>
+              <w:shd w:val="clear" w:fill="F4F7F9"/>
+              <w:spacing w:before="80" w:after="160"/>
+            </w:pPr>
+            <w:r>
+              <w:rPr>
+                <w:rFonts w:ascii="Consolas" w:hAnsi="Consolas"/>
+                <w:sz w:val="19"/>
+              </w:rPr>
+              <w:t>$ cat &gt; mini_wordlist.txt &lt;&lt; EOF</w:t>
+            </w:r>
+            <w:r>
+              <w:br/>
+            </w:r>
+            <w:r>
+              <w:rPr>
+                <w:rFonts w:ascii="Consolas" w:hAnsi="Consolas"/>
+                <w:sz w:val="19"/>
+              </w:rPr>
+              <w:t>futbol</w:t>
+            </w:r>
+            <w:r>
+              <w:br/>
+            </w:r>
+            <w:r>
+              <w:rPr>
+                <w:rFonts w:ascii="Consolas" w:hAnsi="Consolas"/>
+                <w:sz w:val="19"/>
+              </w:rPr>
+              <w:t>futbol1</w:t>
+            </w:r>
+            <w:r>
+              <w:br/>
+            </w:r>
+            <w:r>
+              <w:rPr>
+                <w:rFonts w:ascii="Consolas" w:hAnsi="Consolas"/>
+                <w:sz w:val="19"/>
+              </w:rPr>
+              <w:t>futbol12</w:t>
+            </w:r>
+            <w:r>
+              <w:br/>
+            </w:r>
+            <w:r>
+              <w:rPr>
+                <w:rFonts w:ascii="Consolas" w:hAnsi="Consolas"/>
+                <w:sz w:val="19"/>
+              </w:rPr>
+              <w:t>futbol99</w:t>
+            </w:r>
+            <w:r>
+              <w:br/>
+            </w:r>
+            <w:r>
+              <w:rPr>
+                <w:rFonts w:ascii="Consolas" w:hAnsi="Consolas"/>
+                <w:sz w:val="19"/>
+              </w:rPr>
+              <w:t>futbol2024</w:t>
+            </w:r>
+            <w:r>
+              <w:br/>
+            </w:r>
+            <w:r>
+              <w:rPr>
+                <w:rFonts w:ascii="Consolas" w:hAnsi="Consolas"/>
+                <w:sz w:val="19"/>
+              </w:rPr>
+              <w:t>barcelona</w:t>
+            </w:r>
+            <w:r>
+              <w:br/>
+            </w:r>
+            <w:r>
+              <w:rPr>
+                <w:rFonts w:ascii="Consolas" w:hAnsi="Consolas"/>
+                <w:sz w:val="19"/>
+              </w:rPr>
+              <w:t>madrid</w:t>
+            </w:r>
+            <w:r>
+              <w:br/>
+            </w:r>
+            <w:r>
+              <w:rPr>
+                <w:rFonts w:ascii="Consolas" w:hAnsi="Consolas"/>
+                <w:sz w:val="19"/>
+              </w:rPr>
+              <w:t>football</w:t>
+            </w:r>
+            <w:r>
+              <w:br/>
+            </w:r>
+            <w:r>
+              <w:rPr>
+                <w:rFonts w:ascii="Consolas" w:hAnsi="Consolas"/>
+                <w:sz w:val="19"/>
+              </w:rPr>
+              <w:t>soccer99</w:t>
+            </w:r>
+            <w:r>
+              <w:br/>
+            </w:r>
+            <w:r>
+              <w:rPr>
+                <w:rFonts w:ascii="Consolas" w:hAnsi="Consolas"/>
+                <w:sz w:val="19"/>
+              </w:rPr>
+              <w:t>password</w:t>
+            </w:r>
+            <w:r>
+              <w:br/>
+            </w:r>
+            <w:r>
+              <w:rPr>
+                <w:rFonts w:ascii="Consolas" w:hAnsi="Consolas"/>
+                <w:sz w:val="19"/>
+              </w:rPr>
+              <w:t>123456</w:t>
+            </w:r>
+            <w:r>
+              <w:br/>
+            </w:r>
+            <w:r>
+              <w:rPr>
+                <w:rFonts w:ascii="Consolas" w:hAnsi="Consolas"/>
+                <w:sz w:val="19"/>
+              </w:rPr>
+              <w:t>qwerty</w:t>
+            </w:r>
+            <w:r>
+              <w:br/>
+            </w:r>
+            <w:r>
+              <w:rPr>
+                <w:rFonts w:ascii="Consolas" w:hAnsi="Consolas"/>
+                <w:sz w:val="19"/>
+              </w:rPr>
+              <w:t>EOF</w:t>
+            </w:r>
+            <w:r>
+              <w:br/>
+            </w:r>
+            <w:r>
+              <w:rPr>
+                <w:rFonts w:ascii="Consolas" w:hAnsi="Consolas"/>
+                <w:sz w:val="19"/>
+              </w:rPr>
+            </w:r>
+            <w:r>
+              <w:br/>
+            </w:r>
+            <w:r>
+              <w:rPr>
+                <w:rFonts w:ascii="Consolas" w:hAnsi="Consolas"/>
+                <w:sz w:val="19"/>
+              </w:rPr>
+              <w:t>$ grep ^marina: hashes.txt &gt; marina_hash.txt</w:t>
             </w:r>
           </w:p>
           <w:p>
@@ -3523,6 +3994,16 @@
                 <w:sz w:val="20"/>
               </w:rPr>
               <w:t>Crea dos usuaris de prova propis amb contrasenyes diferents (una basada en una paraula comuna + números, una altra generada aleatòriament amb símbols) i repeteix l’experiment. Respon:</w:t>
+            </w:r>
+          </w:p>
+          <w:p>
+            <w:r>
+              <w:rPr>
+                <w:i/>
+                <w:color w:val="5B6B77"/>
+                <w:sz w:val="18"/>
+              </w:rPr>
+              <w:t>📷 Lliurament: captura de les ordres executades i el resultat.</w:t>
             </w:r>
           </w:p>
           <w:p>
@@ -3701,7 +4182,7 @@
                 <w:b w:val="0"/>
                 <w:sz w:val="20"/>
               </w:rPr>
-              <w:t>Xifra un fitxer amb GPG, utilitzant xifratge simètric (una única contrasenya) amb l’algorisme AES-256:</w:t>
+              <w:t>Crea un fitxer de prova i xifra'l amb GPG, utilitzant xifratge simètric (una única contrasenya) amb l'algorisme AES-256:</w:t>
             </w:r>
           </w:p>
           <w:p>
@@ -3716,6 +4197,16 @@
               <w:shd w:val="clear" w:fill="F4F7F9"/>
               <w:spacing w:before="80" w:after="160"/>
             </w:pPr>
+            <w:r>
+              <w:rPr>
+                <w:rFonts w:ascii="Consolas" w:hAnsi="Consolas"/>
+                <w:sz w:val="19"/>
+              </w:rPr>
+              <w:t>$ echo "Informe confidencial: qualificacions trimestrals del grup SMX2C." &gt; informe.txt</w:t>
+            </w:r>
+            <w:r>
+              <w:br/>
+            </w:r>
             <w:r>
               <w:rPr>
                 <w:rFonts w:ascii="Consolas" w:hAnsi="Consolas"/>
@@ -3846,6 +4337,16 @@
                 <w:sz w:val="20"/>
               </w:rPr>
               <w:t>Reprodueix-ho amb un fitxer propi i respon:</w:t>
+            </w:r>
+          </w:p>
+          <w:p>
+            <w:r>
+              <w:rPr>
+                <w:i/>
+                <w:color w:val="5B6B77"/>
+                <w:sz w:val="18"/>
+              </w:rPr>
+              <w:t>📷 Lliurament: captura de les ordres executades i el resultat.</w:t>
             </w:r>
           </w:p>
           <w:p>
@@ -4128,6 +4629,127 @@
         </w:rPr>
       </w:r>
     </w:p>
+    <w:tbl>
+      <w:tblPr>
+        <w:tblStyle w:val="Table3"/>
+        <w:tblW w:w="9630.0" w:type="dxa"/>
+        <w:jc w:val="left"/>
+        <w:tblInd w:w="-100.0" w:type="dxa"/>
+        <w:tblBorders>
+          <w:top w:color="000000" w:space="0" w:sz="8" w:val="single"/>
+          <w:left w:color="000000" w:space="0" w:sz="8" w:val="single"/>
+          <w:bottom w:color="000000" w:space="0" w:sz="8" w:val="single"/>
+          <w:right w:color="000000" w:space="0" w:sz="8" w:val="single"/>
+          <w:insideH w:color="000000" w:space="0" w:sz="8" w:val="single"/>
+          <w:insideV w:color="000000" w:space="0" w:sz="8" w:val="single"/>
+        </w:tblBorders>
+        <w:tblLayout w:type="fixed"/>
+        <w:tblLook w:val="0600"/>
+      </w:tblPr>
+      <w:tblGrid>
+        <w:gridCol w:w="9630"/>
+        <w:tblGridChange w:id="0">
+          <w:tblGrid>
+            <w:gridCol w:w="9630"/>
+          </w:tblGrid>
+        </w:tblGridChange>
+      </w:tblGrid>
+      <w:tr>
+        <w:trPr>
+          <w:cantSplit w:val="0"/>
+          <w:trHeight w:val="480" w:hRule="atLeast"/>
+          <w:tblHeader w:val="0"/>
+        </w:trPr>
+        <w:tc>
+          <w:tcPr>
+            <w:shd w:fill="d9d9d9" w:val="clear"/>
+            <w:tcMar>
+              <w:top w:w="100.0" w:type="dxa"/>
+              <w:left w:w="100.0" w:type="dxa"/>
+              <w:bottom w:w="100.0" w:type="dxa"/>
+              <w:right w:w="100.0" w:type="dxa"/>
+            </w:tcMar>
+          </w:tcPr>
+          <w:p>
+            <w:pPr>
+              <w:pStyle w:val="Heading2"/>
+              <w:pBdr>
+                <w:bottom w:color="auto" w:space="0" w:sz="0" w:val="none"/>
+              </w:pBdr>
+              <w:spacing w:before="0" w:line="276" w:lineRule="auto"/>
+              <w:jc w:val="left"/>
+              <w:rPr>
+                <w:rFonts w:ascii="Verdana" w:cs="Verdana" w:eastAsia="Verdana" w:hAnsi="Verdana"/>
+              </w:rPr>
+            </w:pPr>
+            <w:r>
+              <w:rPr>
+                <w:rFonts w:ascii="Verdana" w:cs="Verdana" w:eastAsia="Verdana" w:hAnsi="Verdana"/>
+                <w:rtl w:val="0"/>
+              </w:rPr>
+              <w:t>Lliurament final — Historial de comandes</w:t>
+            </w:r>
+          </w:p>
+        </w:tc>
+      </w:tr>
+      <w:tr>
+        <w:trPr>
+          <w:cantSplit w:val="0"/>
+          <w:trHeight w:val="420" w:hRule="atLeast"/>
+          <w:tblHeader w:val="0"/>
+        </w:trPr>
+        <w:tc>
+          <w:tcPr>
+            <w:shd w:fill="auto" w:val="clear"/>
+            <w:tcMar>
+              <w:top w:w="100.0" w:type="dxa"/>
+              <w:left w:w="100.0" w:type="dxa"/>
+              <w:bottom w:w="100.0" w:type="dxa"/>
+              <w:right w:w="100.0" w:type="dxa"/>
+            </w:tcMar>
+          </w:tcPr>
+          <w:p>
+            <w:r>
+              <w:rPr>
+                <w:sz w:val="20"/>
+              </w:rPr>
+              <w:t>Un cop finalitzats tots els exercicis pràctics (12 a 16), abans de lliurar la pràctica cal aportar una darrera captura: l'historial complet de totes les ordres que has executat al terminal al llarg de tota la pràctica.</w:t>
+            </w:r>
+          </w:p>
+          <w:p>
+            <w:pPr>
+              <w:jc w:val="left"/>
+              <w:pBdr>
+                <w:top w:val="single" w:color="CADCE8" w:sz="4"/>
+                <w:bottom w:val="single" w:color="CADCE8" w:sz="4"/>
+                <w:left w:val="single" w:color="CADCE8" w:sz="4"/>
+                <w:right w:val="single" w:color="CADCE8" w:sz="4"/>
+              </w:pBdr>
+              <w:shd w:val="clear" w:fill="F4F7F9"/>
+              <w:spacing w:before="80" w:after="160"/>
+            </w:pPr>
+            <w:r>
+              <w:rPr>
+                <w:rFonts w:ascii="Consolas" w:hAnsi="Consolas"/>
+                <w:sz w:val="19"/>
+              </w:rPr>
+              <w:t>$ history</w:t>
+            </w:r>
+          </w:p>
+          <w:p>
+            <w:r>
+              <w:rPr>
+                <w:i/>
+                <w:color w:val="5B6B77"/>
+                <w:sz w:val="18"/>
+              </w:rPr>
+              <w:t>La captura ha de mostrar la llista completa d'ordres de la sessió, incloent-hi la mateixa ordre history. Fes-ho sense tancar el terminal entre exercicis, per tal que l'historial no es perdi abans d'arribar al final de la pràctica.</w:t>
+            </w:r>
+          </w:p>
+        </w:tc>
+      </w:tr>
+    </w:tbl>
+    <w:p/>
     <w:p>
       <w:pPr>
         <w:spacing w:before="200" w:line="276" w:lineRule="auto"/>

</xml_diff>